<commit_message>
Chart count: thirteen chart families (radar included)
</commit_message>
<xml_diff>
--- a/docs/PandaLens-亮点说明.docx
+++ b/docs/PandaLens-亮点说明.docx
@@ -77,7 +77,7 @@
           <w:color w:val="12233F"/>
           <w:sz w:val="21"/>
         </w:rPr>
-        <w:t>https://2254193662lzx.github.io/pandalens/ **源代码仓库：** https://github.com/2254193662lzx/pandalens **视频：** PandaLens-demo.mp4（4 分 45 秒，中文讲解，含字幕，字幕文件 PandaLens-demo.zh.srt）</w:t>
+        <w:t>https://2254193662lzx.github.io/pandalens/ **源代码仓库：** https://github.com/2254193662lzx/pandalens **视频：** PandaLens-demo.mp4（4 分 49 秒，中文讲解，含字幕，字幕文件 PandaLens-demo.zh.srt）</w:t>
       </w:r>
     </w:p>
     <w:p/>
@@ -2557,7 +2557,7 @@
                 <w:b w:val="0"/>
                 <w:sz w:val="18"/>
               </w:rPr>
-              <w:t>（4:45，中文讲解 + 内嵌字幕）</w:t>
+              <w:t>（4:49，中文讲解 + 内嵌字幕）</w:t>
             </w:r>
           </w:p>
         </w:tc>

</xml_diff>

<commit_message>
Update highlights document: 13 chart families, corrected video duration
</commit_message>
<xml_diff>
--- a/docs/PandaLens-亮点说明.docx
+++ b/docs/PandaLens-亮点说明.docx
@@ -77,7 +77,53 @@
           <w:color w:val="12233F"/>
           <w:sz w:val="21"/>
         </w:rPr>
-        <w:t>https://2254193662lzx.github.io/pandalens/ **源代码仓库：** https://github.com/2254193662lzx/pandalens **视频：** PandaLens-demo.mp4（4 分 49 秒，中文讲解，含字幕，字幕文件 PandaLens-demo.zh.srt）</w:t>
+        <w:t>https://2254193662lzx.github.io/pandalens/</w:t>
+      </w:r>
+    </w:p>
+    <w:p>
+      <w:pPr>
+        <w:spacing w:after="80"/>
+      </w:pPr>
+      <w:r>
+        <w:rPr>
+          <w:rFonts w:ascii="微软雅黑" w:hAnsi="微软雅黑" w:eastAsia="微软雅黑"/>
+          <w:b/>
+          <w:color w:val="6B7688"/>
+          <w:sz w:val="21"/>
+        </w:rPr>
+        <w:t xml:space="preserve">源代码仓库  </w:t>
+      </w:r>
+      <w:r>
+        <w:rPr>
+          <w:rFonts w:ascii="微软雅黑" w:hAnsi="微软雅黑" w:eastAsia="微软雅黑"/>
+          <w:b w:val="0"/>
+          <w:color w:val="12233F"/>
+          <w:sz w:val="21"/>
+        </w:rPr>
+        <w:t>https://github.com/2254193662lzx/pandalens</w:t>
+      </w:r>
+    </w:p>
+    <w:p>
+      <w:pPr>
+        <w:spacing w:after="80"/>
+      </w:pPr>
+      <w:r>
+        <w:rPr>
+          <w:rFonts w:ascii="微软雅黑" w:hAnsi="微软雅黑" w:eastAsia="微软雅黑"/>
+          <w:b/>
+          <w:color w:val="6B7688"/>
+          <w:sz w:val="21"/>
+        </w:rPr>
+        <w:t xml:space="preserve">视频  </w:t>
+      </w:r>
+      <w:r>
+        <w:rPr>
+          <w:rFonts w:ascii="微软雅黑" w:hAnsi="微软雅黑" w:eastAsia="微软雅黑"/>
+          <w:b w:val="0"/>
+          <w:color w:val="12233F"/>
+          <w:sz w:val="21"/>
+        </w:rPr>
+        <w:t>PandaLens-demo.mp4（4 分 49 秒，中文讲解 + 中文字幕）</w:t>
       </w:r>
     </w:p>
     <w:p/>
@@ -1312,7 +1358,7 @@
         <w:pStyle w:val="Heading1"/>
       </w:pPr>
       <w:r>
-        <w:t>五、12 类图形，每一类都为"分析"而设计</w:t>
+        <w:t>五、13 类图形，每一类都为"分析"而设计</w:t>
       </w:r>
     </w:p>
     <w:p>
@@ -1899,6 +1945,49 @@
                 <w:sz w:val="18"/>
               </w:rPr>
               <w:t>两层级的构成占比</w:t>
+            </w:r>
+          </w:p>
+        </w:tc>
+      </w:tr>
+      <w:tr>
+        <w:trPr>
+          <w:cantSplit/>
+        </w:trPr>
+        <w:tc>
+          <w:tcPr>
+            <w:tcW w:type="dxa" w:w="4933"/>
+          </w:tcPr>
+          <w:p>
+            <w:pPr>
+              <w:spacing w:after="40"/>
+            </w:pPr>
+            <w:r/>
+            <w:r>
+              <w:rPr>
+                <w:rFonts w:ascii="微软雅黑" w:hAnsi="微软雅黑" w:eastAsia="微软雅黑"/>
+                <w:b w:val="0"/>
+                <w:sz w:val="18"/>
+              </w:rPr>
+              <w:t>雷达图</w:t>
+            </w:r>
+          </w:p>
+        </w:tc>
+        <w:tc>
+          <w:tcPr>
+            <w:tcW w:type="dxa" w:w="4933"/>
+          </w:tcPr>
+          <w:p>
+            <w:pPr>
+              <w:spacing w:after="40"/>
+            </w:pPr>
+            <w:r/>
+            <w:r>
+              <w:rPr>
+                <w:rFonts w:ascii="微软雅黑" w:hAnsi="微软雅黑" w:eastAsia="微软雅黑"/>
+                <w:b w:val="0"/>
+                <w:sz w:val="18"/>
+              </w:rPr>
+              <w:t>多个指标归一化后，各群体的"画像"有什么不同？</w:t>
             </w:r>
           </w:p>
         </w:tc>
@@ -2557,7 +2646,24 @@
                 <w:b w:val="0"/>
                 <w:sz w:val="18"/>
               </w:rPr>
-              <w:t>（4:49，中文讲解 + 内嵌字幕）</w:t>
+              <w:t xml:space="preserve">（4:49，中文讲解 + 内嵌字幕；字幕文件 </w:t>
+            </w:r>
+            <w:r>
+              <w:rPr>
+                <w:rFonts w:ascii="Consolas" w:hAnsi="Consolas" w:eastAsia="微软雅黑"/>
+                <w:b w:val="0"/>
+                <w:color w:val="1D4ED8"/>
+                <w:sz w:val="17"/>
+              </w:rPr>
+              <w:t>PandaLens-demo.zh.srt</w:t>
+            </w:r>
+            <w:r>
+              <w:rPr>
+                <w:rFonts w:ascii="微软雅黑" w:hAnsi="微软雅黑" w:eastAsia="微软雅黑"/>
+                <w:b w:val="0"/>
+                <w:sz w:val="18"/>
+              </w:rPr>
+              <w:t>）</w:t>
             </w:r>
           </w:p>
         </w:tc>

</xml_diff>

<commit_message>
Source archive contains website code only; fix name typo in the highlights document
</commit_message>
<xml_diff>
--- a/docs/PandaLens-亮点说明.docx
+++ b/docs/PandaLens-亮点说明.docx
@@ -138,7 +138,7 @@
           <w:color w:val="6B7688"/>
           <w:sz w:val="18"/>
         </w:rPr>
-        <w:t>数据可视化课程项目 · 2026-10-09</w:t>
+        <w:t>数据可视化课程项目 · 2026-10-15</w:t>
       </w:r>
     </w:p>
     <w:p>
@@ -2035,7 +2035,7 @@
         <w:spacing w:after="60" w:line="300" w:lineRule="auto"/>
       </w:pPr>
       <w:r>
-        <w:t>缺失值专题：缺失矩阵的行按缺失多少排序（缺失no 的做法），因此数据缺口会成簇显形；另外提供按列缺失比例的条形图和缺失相关性热力图。</w:t>
+        <w:t>缺失值专题：缺失矩阵的行按缺失多少排序（missingno 库的做法），因此数据缺口会成簇显形；另外提供按列缺失比例的条形图和缺失相关性热力图。</w:t>
       </w:r>
     </w:p>
     <w:p>
@@ -2594,7 +2594,7 @@
                 <w:b w:val="0"/>
                 <w:sz w:val="18"/>
               </w:rPr>
-              <w:t>（含网站源码、数据、验证脚本）</w:t>
+              <w:t>（只含网站源码：页面、样式、脚本与第三方运行库，共 15 个文件）</w:t>
             </w:r>
           </w:p>
         </w:tc>

</xml_diff>